<commit_message>
Docs: EXECUTIVE_SUMMARY v7.1 — refinements
- Section 1 (Для кого/Навіщо): trimmed obvious context — director knows the process
- Section 2: split into 'Перенесення з СРМ Встречі' (Meetings ported from existing meeting-4.0) and 'Нові модулі' (the other 4 built from scratch)
- Removed Contacts section

Co-Authored-By: Claude Opus 4.7 <noreply@anthropic.com>
</commit_message>
<xml_diff>
--- a/docs/EXECUTIVE_SUMMARY.docx
+++ b/docs/EXECUTIVE_SUMMARY.docx
@@ -108,7 +108,7 @@
           <w:b w:val="0"/>
           <w:i w:val="0"/>
         </w:rPr>
-        <w:t xml:space="preserve"> 21 менеджер відділу продажу + керівництво відділу.</w:t>
+        <w:t xml:space="preserve"> менеджери відділу продажу + керівництво відділу.</w:t>
       </w:r>
     </w:p>
     <w:p>
@@ -124,24 +124,7 @@
           <w:b w:val="0"/>
           <w:i w:val="0"/>
         </w:rPr>
-        <w:t xml:space="preserve"> зараз менеджер всю щоденну роботу виконує у 1С, яка живе на офісному сервері. Це означає: щоб занести замовлення після зустрічі, переглянути історію клієнта чи перевірити дебіторку — потрібен ноутбук у офісі. Розширюємо існуючу систему </w:t>
-      </w:r>
-      <w:r>
-        <w:rPr>
-          <w:rFonts w:ascii="Consolas" w:hAnsi="Consolas"/>
-          <w:b w:val="0"/>
-          <w:i w:val="0"/>
-          <w:color w:val="334155"/>
-          <w:sz w:val="20"/>
-        </w:rPr>
-        <w:t>sales-planning</w:t>
-      </w:r>
-      <w:r>
-        <w:rPr>
-          <w:b w:val="0"/>
-          <w:i w:val="0"/>
-        </w:rPr>
-        <w:t xml:space="preserve"> так, щоб менеджер виконував усю цю роботу з телефона чи планшета у будь-якому місці — у машині між візитами, на зустрічі у клієнта, з дому. 1С залишається як база даних компанії, але прямого доступу менеджера до неї більше не потрібно.</w:t>
+        <w:t xml:space="preserve"> винести щоденну роботу менеджера з 1С у мобільну CRM, щоб працювати з телефона у полі. 1С залишається базою даних.</w:t>
       </w:r>
     </w:p>
     <w:p>
@@ -251,28 +234,29 @@
           <w:color w:val="334155"/>
           <w:sz w:val="26"/>
         </w:rPr>
-        <w:t>Нові модулі (додаємо)</w:t>
+        <w:t>Зустрічі — переносимо з існуючої СРМ Встречі і об'єднуємо</w:t>
       </w:r>
     </w:p>
     <w:p>
-      <w:pPr>
-        <w:pStyle w:val="ListBullet"/>
-        <w:spacing w:after="40"/>
-        <w:ind w:left="340"/>
-      </w:pPr>
-      <w:r>
-        <w:rPr>
-          <w:b/>
-          <w:i w:val="0"/>
-        </w:rPr>
-        <w:t>Зустрічі</w:t>
-      </w:r>
       <w:r>
         <w:rPr>
           <w:b w:val="0"/>
           <w:i w:val="0"/>
         </w:rPr>
-        <w:t xml:space="preserve"> — фіксація зустрічей з геолокацією, з мобільного у полі</w:t>
+        <w:t>Функціонал зустрічей зараз живе у окремій СРМ Встречі (meeting-4.0). Переносимо його у нашу CRM з покращеннями: стабільніша геолокація, мобільна форма створення і редагування зустрічі, фонова синхронізація з 1С, синхронізація з Google Calendar.</w:t>
+      </w:r>
+    </w:p>
+    <w:p>
+      <w:pPr>
+        <w:spacing w:before="200" w:after="80"/>
+      </w:pPr>
+      <w:r>
+        <w:rPr>
+          <w:b/>
+          <w:color w:val="334155"/>
+          <w:sz w:val="26"/>
+        </w:rPr>
+        <w:t>Нові модулі (розробляємо з нуля)</w:t>
       </w:r>
     </w:p>
     <w:p>

</xml_diff>

<commit_message>
Docs: EXECUTIVE_SUMMARY v8.1 — preserved user edits + market rates section
Changes:
- Section 6 (Бюджет): added 'Ринкова вартість аналогічної розробки'
  subsection with realistic Ukrainian 2026 senior dev rates (not
  inflated). Includes both done work (~500-700h) and new extension
  (~400-500h), with solo freelance (5-35/hr) and outsource agency
  with PM/QA (0-55/hr) scenarios. Combined: $22,500-$66,000
  range depending on engagement model
- Section 'Підсумок' at end — preserved user's manual addition from
  her direct Word edit: project framed as strategic transformation,
  no contractor costs, $612/year infrastructure

DOCX regenerated.

Co-Authored-By: Claude Opus 4.7 <noreply@anthropic.com>
</commit_message>
<xml_diff>
--- a/docs/EXECUTIVE_SUMMARY.docx
+++ b/docs/EXECUTIVE_SUMMARY.docx
@@ -2627,6 +2627,471 @@
     </w:p>
     <w:p>
       <w:pPr>
+        <w:spacing w:before="200" w:after="80"/>
+      </w:pPr>
+      <w:r>
+        <w:rPr>
+          <w:b/>
+          <w:color w:val="334155"/>
+          <w:sz w:val="26"/>
+        </w:rPr>
+        <w:t>Ринкова вартість аналогічної розробки</w:t>
+      </w:r>
+    </w:p>
+    <w:p>
+      <w:r>
+        <w:rPr>
+          <w:b w:val="0"/>
+          <w:i w:val="0"/>
+        </w:rPr>
+        <w:t>Для розуміння масштабу — скільки коштувала би така ж розробка, якби виконувалась зовнішнім розробником або підрядником. Розрахунок за поточними ставками українського ринку 2026 для досвідченого розробника зі стеком Next.js + TypeScript + Postgres + ERP-інтеграція:</w:t>
+      </w:r>
+    </w:p>
+    <w:tbl>
+      <w:tblPr>
+        <w:tblW w:type="auto" w:w="0"/>
+        <w:jc w:val="center"/>
+        <w:tblLook w:firstColumn="1" w:firstRow="1" w:lastColumn="0" w:lastRow="0" w:noHBand="0" w:noVBand="1" w:val="04A0"/>
+      </w:tblPr>
+      <w:tblGrid>
+        <w:gridCol w:w="2409"/>
+        <w:gridCol w:w="2409"/>
+        <w:gridCol w:w="2409"/>
+        <w:gridCol w:w="2409"/>
+      </w:tblGrid>
+      <w:tr>
+        <w:tc>
+          <w:tcPr>
+            <w:tcW w:type="dxa" w:w="2409"/>
+            <w:vAlign w:val="center"/>
+            <w:shd w:val="clear" w:color="auto" w:fill="066AAB"/>
+            <w:tcBorders>
+              <w:top w:val="single" w:sz="4" w:color="054D80"/>
+              <w:left w:val="single" w:sz="4" w:color="054D80"/>
+              <w:bottom w:val="single" w:sz="4" w:color="054D80"/>
+              <w:right w:val="single" w:sz="4" w:color="054D80"/>
+            </w:tcBorders>
+          </w:tcPr>
+          <w:p>
+            <w:pPr>
+              <w:spacing w:before="40" w:after="40"/>
+            </w:pPr>
+            <w:r>
+              <w:rPr>
+                <w:b/>
+                <w:color w:val="FFFFFF"/>
+                <w:sz w:val="20"/>
+              </w:rPr>
+              <w:t>Що</w:t>
+            </w:r>
+          </w:p>
+        </w:tc>
+        <w:tc>
+          <w:tcPr>
+            <w:tcW w:type="dxa" w:w="2409"/>
+            <w:vAlign w:val="center"/>
+            <w:shd w:val="clear" w:color="auto" w:fill="066AAB"/>
+            <w:tcBorders>
+              <w:top w:val="single" w:sz="4" w:color="054D80"/>
+              <w:left w:val="single" w:sz="4" w:color="054D80"/>
+              <w:bottom w:val="single" w:sz="4" w:color="054D80"/>
+              <w:right w:val="single" w:sz="4" w:color="054D80"/>
+            </w:tcBorders>
+          </w:tcPr>
+          <w:p>
+            <w:pPr>
+              <w:spacing w:before="40" w:after="40"/>
+            </w:pPr>
+            <w:r>
+              <w:rPr>
+                <w:b/>
+                <w:color w:val="FFFFFF"/>
+                <w:sz w:val="20"/>
+              </w:rPr>
+              <w:t>Орієнтовний обсяг</w:t>
+            </w:r>
+          </w:p>
+        </w:tc>
+        <w:tc>
+          <w:tcPr>
+            <w:tcW w:type="dxa" w:w="2409"/>
+            <w:vAlign w:val="center"/>
+            <w:shd w:val="clear" w:color="auto" w:fill="066AAB"/>
+            <w:tcBorders>
+              <w:top w:val="single" w:sz="4" w:color="054D80"/>
+              <w:left w:val="single" w:sz="4" w:color="054D80"/>
+              <w:bottom w:val="single" w:sz="4" w:color="054D80"/>
+              <w:right w:val="single" w:sz="4" w:color="054D80"/>
+            </w:tcBorders>
+          </w:tcPr>
+          <w:p>
+            <w:pPr>
+              <w:spacing w:before="40" w:after="40"/>
+            </w:pPr>
+            <w:r>
+              <w:rPr>
+                <w:b/>
+                <w:color w:val="FFFFFF"/>
+                <w:sz w:val="20"/>
+              </w:rPr>
+              <w:t>Вартість (senior solo, $25-35/год)</w:t>
+            </w:r>
+          </w:p>
+        </w:tc>
+        <w:tc>
+          <w:tcPr>
+            <w:tcW w:type="dxa" w:w="2409"/>
+            <w:vAlign w:val="center"/>
+            <w:shd w:val="clear" w:color="auto" w:fill="066AAB"/>
+            <w:tcBorders>
+              <w:top w:val="single" w:sz="4" w:color="054D80"/>
+              <w:left w:val="single" w:sz="4" w:color="054D80"/>
+              <w:bottom w:val="single" w:sz="4" w:color="054D80"/>
+              <w:right w:val="single" w:sz="4" w:color="054D80"/>
+            </w:tcBorders>
+          </w:tcPr>
+          <w:p>
+            <w:pPr>
+              <w:spacing w:before="40" w:after="40"/>
+            </w:pPr>
+            <w:r>
+              <w:rPr>
+                <w:b/>
+                <w:color w:val="FFFFFF"/>
+                <w:sz w:val="20"/>
+              </w:rPr>
+              <w:t>Вартість (аутсорс-агенція з PM/QA, $40-55/год)</w:t>
+            </w:r>
+          </w:p>
+        </w:tc>
+      </w:tr>
+      <w:tr>
+        <w:tc>
+          <w:tcPr>
+            <w:tcW w:type="dxa" w:w="2409"/>
+            <w:vAlign w:val="center"/>
+            <w:tcBorders>
+              <w:top w:val="single" w:sz="4" w:color="D5DAE0"/>
+              <w:left w:val="single" w:sz="4" w:color="D5DAE0"/>
+              <w:bottom w:val="single" w:sz="4" w:color="D5DAE0"/>
+              <w:right w:val="single" w:sz="4" w:color="D5DAE0"/>
+            </w:tcBorders>
+          </w:tcPr>
+          <w:p>
+            <w:pPr>
+              <w:spacing w:before="60" w:after="60"/>
+            </w:pPr>
+            <w:r>
+              <w:rPr>
+                <w:b w:val="0"/>
+                <w:i w:val="0"/>
+                <w:sz w:val="20"/>
+              </w:rPr>
+              <w:t>Що вже реалізовано (3 модулі у проді)</w:t>
+            </w:r>
+          </w:p>
+        </w:tc>
+        <w:tc>
+          <w:tcPr>
+            <w:tcW w:type="dxa" w:w="2409"/>
+            <w:vAlign w:val="center"/>
+            <w:tcBorders>
+              <w:top w:val="single" w:sz="4" w:color="D5DAE0"/>
+              <w:left w:val="single" w:sz="4" w:color="D5DAE0"/>
+              <w:bottom w:val="single" w:sz="4" w:color="D5DAE0"/>
+              <w:right w:val="single" w:sz="4" w:color="D5DAE0"/>
+            </w:tcBorders>
+          </w:tcPr>
+          <w:p>
+            <w:pPr>
+              <w:spacing w:before="60" w:after="60"/>
+            </w:pPr>
+            <w:r>
+              <w:rPr>
+                <w:b w:val="0"/>
+                <w:i w:val="0"/>
+                <w:sz w:val="20"/>
+              </w:rPr>
+              <w:t>~500-700 годин</w:t>
+            </w:r>
+          </w:p>
+        </w:tc>
+        <w:tc>
+          <w:tcPr>
+            <w:tcW w:type="dxa" w:w="2409"/>
+            <w:vAlign w:val="center"/>
+            <w:tcBorders>
+              <w:top w:val="single" w:sz="4" w:color="D5DAE0"/>
+              <w:left w:val="single" w:sz="4" w:color="D5DAE0"/>
+              <w:bottom w:val="single" w:sz="4" w:color="D5DAE0"/>
+              <w:right w:val="single" w:sz="4" w:color="D5DAE0"/>
+            </w:tcBorders>
+          </w:tcPr>
+          <w:p>
+            <w:pPr>
+              <w:spacing w:before="60" w:after="60"/>
+            </w:pPr>
+            <w:r>
+              <w:rPr>
+                <w:b w:val="0"/>
+                <w:i w:val="0"/>
+                <w:sz w:val="20"/>
+              </w:rPr>
+              <w:t>$12 500 - $24 500</w:t>
+            </w:r>
+          </w:p>
+        </w:tc>
+        <w:tc>
+          <w:tcPr>
+            <w:tcW w:type="dxa" w:w="2409"/>
+            <w:vAlign w:val="center"/>
+            <w:tcBorders>
+              <w:top w:val="single" w:sz="4" w:color="D5DAE0"/>
+              <w:left w:val="single" w:sz="4" w:color="D5DAE0"/>
+              <w:bottom w:val="single" w:sz="4" w:color="D5DAE0"/>
+              <w:right w:val="single" w:sz="4" w:color="D5DAE0"/>
+            </w:tcBorders>
+          </w:tcPr>
+          <w:p>
+            <w:pPr>
+              <w:spacing w:before="60" w:after="60"/>
+            </w:pPr>
+            <w:r>
+              <w:rPr>
+                <w:b w:val="0"/>
+                <w:i w:val="0"/>
+                <w:sz w:val="20"/>
+              </w:rPr>
+              <w:t>$20 000 - $38 500</w:t>
+            </w:r>
+          </w:p>
+        </w:tc>
+      </w:tr>
+      <w:tr>
+        <w:tc>
+          <w:tcPr>
+            <w:tcW w:type="dxa" w:w="2409"/>
+            <w:vAlign w:val="center"/>
+            <w:tcBorders>
+              <w:top w:val="single" w:sz="4" w:color="D5DAE0"/>
+              <w:left w:val="single" w:sz="4" w:color="D5DAE0"/>
+              <w:bottom w:val="single" w:sz="4" w:color="D5DAE0"/>
+              <w:right w:val="single" w:sz="4" w:color="D5DAE0"/>
+            </w:tcBorders>
+            <w:shd w:val="clear" w:color="auto" w:fill="F8FAFC"/>
+          </w:tcPr>
+          <w:p>
+            <w:pPr>
+              <w:spacing w:before="60" w:after="60"/>
+            </w:pPr>
+            <w:r>
+              <w:rPr>
+                <w:b w:val="0"/>
+                <w:i w:val="0"/>
+                <w:sz w:val="20"/>
+              </w:rPr>
+              <w:t>CRM-розширення (4 нових модулі + перенесення зустрічей)</w:t>
+            </w:r>
+          </w:p>
+        </w:tc>
+        <w:tc>
+          <w:tcPr>
+            <w:tcW w:type="dxa" w:w="2409"/>
+            <w:vAlign w:val="center"/>
+            <w:tcBorders>
+              <w:top w:val="single" w:sz="4" w:color="D5DAE0"/>
+              <w:left w:val="single" w:sz="4" w:color="D5DAE0"/>
+              <w:bottom w:val="single" w:sz="4" w:color="D5DAE0"/>
+              <w:right w:val="single" w:sz="4" w:color="D5DAE0"/>
+            </w:tcBorders>
+            <w:shd w:val="clear" w:color="auto" w:fill="F8FAFC"/>
+          </w:tcPr>
+          <w:p>
+            <w:pPr>
+              <w:spacing w:before="60" w:after="60"/>
+            </w:pPr>
+            <w:r>
+              <w:rPr>
+                <w:b w:val="0"/>
+                <w:i w:val="0"/>
+                <w:sz w:val="20"/>
+              </w:rPr>
+              <w:t>~400-500 годин</w:t>
+            </w:r>
+          </w:p>
+        </w:tc>
+        <w:tc>
+          <w:tcPr>
+            <w:tcW w:type="dxa" w:w="2409"/>
+            <w:vAlign w:val="center"/>
+            <w:tcBorders>
+              <w:top w:val="single" w:sz="4" w:color="D5DAE0"/>
+              <w:left w:val="single" w:sz="4" w:color="D5DAE0"/>
+              <w:bottom w:val="single" w:sz="4" w:color="D5DAE0"/>
+              <w:right w:val="single" w:sz="4" w:color="D5DAE0"/>
+            </w:tcBorders>
+            <w:shd w:val="clear" w:color="auto" w:fill="F8FAFC"/>
+          </w:tcPr>
+          <w:p>
+            <w:pPr>
+              <w:spacing w:before="60" w:after="60"/>
+            </w:pPr>
+            <w:r>
+              <w:rPr>
+                <w:b w:val="0"/>
+                <w:i w:val="0"/>
+                <w:sz w:val="20"/>
+              </w:rPr>
+              <w:t>$10 000 - $17 500</w:t>
+            </w:r>
+          </w:p>
+        </w:tc>
+        <w:tc>
+          <w:tcPr>
+            <w:tcW w:type="dxa" w:w="2409"/>
+            <w:vAlign w:val="center"/>
+            <w:tcBorders>
+              <w:top w:val="single" w:sz="4" w:color="D5DAE0"/>
+              <w:left w:val="single" w:sz="4" w:color="D5DAE0"/>
+              <w:bottom w:val="single" w:sz="4" w:color="D5DAE0"/>
+              <w:right w:val="single" w:sz="4" w:color="D5DAE0"/>
+            </w:tcBorders>
+            <w:shd w:val="clear" w:color="auto" w:fill="F8FAFC"/>
+          </w:tcPr>
+          <w:p>
+            <w:pPr>
+              <w:spacing w:before="60" w:after="60"/>
+            </w:pPr>
+            <w:r>
+              <w:rPr>
+                <w:b w:val="0"/>
+                <w:i w:val="0"/>
+                <w:sz w:val="20"/>
+              </w:rPr>
+              <w:t>$16 000 - $27 500</w:t>
+            </w:r>
+          </w:p>
+        </w:tc>
+      </w:tr>
+      <w:tr>
+        <w:tc>
+          <w:tcPr>
+            <w:tcW w:type="dxa" w:w="2409"/>
+            <w:vAlign w:val="center"/>
+            <w:tcBorders>
+              <w:top w:val="single" w:sz="4" w:color="D5DAE0"/>
+              <w:left w:val="single" w:sz="4" w:color="D5DAE0"/>
+              <w:bottom w:val="single" w:sz="4" w:color="D5DAE0"/>
+              <w:right w:val="single" w:sz="4" w:color="D5DAE0"/>
+            </w:tcBorders>
+          </w:tcPr>
+          <w:p>
+            <w:pPr>
+              <w:spacing w:before="60" w:after="60"/>
+            </w:pPr>
+            <w:r>
+              <w:rPr>
+                <w:b/>
+                <w:i w:val="0"/>
+                <w:sz w:val="20"/>
+              </w:rPr>
+              <w:t>Разом</w:t>
+            </w:r>
+          </w:p>
+        </w:tc>
+        <w:tc>
+          <w:tcPr>
+            <w:tcW w:type="dxa" w:w="2409"/>
+            <w:vAlign w:val="center"/>
+            <w:tcBorders>
+              <w:top w:val="single" w:sz="4" w:color="D5DAE0"/>
+              <w:left w:val="single" w:sz="4" w:color="D5DAE0"/>
+              <w:bottom w:val="single" w:sz="4" w:color="D5DAE0"/>
+              <w:right w:val="single" w:sz="4" w:color="D5DAE0"/>
+            </w:tcBorders>
+          </w:tcPr>
+          <w:p>
+            <w:pPr>
+              <w:spacing w:before="60" w:after="60"/>
+            </w:pPr>
+            <w:r>
+              <w:rPr>
+                <w:b/>
+                <w:i w:val="0"/>
+                <w:sz w:val="20"/>
+              </w:rPr>
+              <w:t>~900-1200 годин</w:t>
+            </w:r>
+          </w:p>
+        </w:tc>
+        <w:tc>
+          <w:tcPr>
+            <w:tcW w:type="dxa" w:w="2409"/>
+            <w:vAlign w:val="center"/>
+            <w:tcBorders>
+              <w:top w:val="single" w:sz="4" w:color="D5DAE0"/>
+              <w:left w:val="single" w:sz="4" w:color="D5DAE0"/>
+              <w:bottom w:val="single" w:sz="4" w:color="D5DAE0"/>
+              <w:right w:val="single" w:sz="4" w:color="D5DAE0"/>
+            </w:tcBorders>
+          </w:tcPr>
+          <w:p>
+            <w:pPr>
+              <w:spacing w:before="60" w:after="60"/>
+            </w:pPr>
+            <w:r>
+              <w:rPr>
+                <w:b/>
+                <w:i w:val="0"/>
+                <w:sz w:val="20"/>
+              </w:rPr>
+              <w:t>$22 500 - $42 000</w:t>
+            </w:r>
+          </w:p>
+        </w:tc>
+        <w:tc>
+          <w:tcPr>
+            <w:tcW w:type="dxa" w:w="2409"/>
+            <w:vAlign w:val="center"/>
+            <w:tcBorders>
+              <w:top w:val="single" w:sz="4" w:color="D5DAE0"/>
+              <w:left w:val="single" w:sz="4" w:color="D5DAE0"/>
+              <w:bottom w:val="single" w:sz="4" w:color="D5DAE0"/>
+              <w:right w:val="single" w:sz="4" w:color="D5DAE0"/>
+            </w:tcBorders>
+          </w:tcPr>
+          <w:p>
+            <w:pPr>
+              <w:spacing w:before="60" w:after="60"/>
+            </w:pPr>
+            <w:r>
+              <w:rPr>
+                <w:b/>
+                <w:i w:val="0"/>
+                <w:sz w:val="20"/>
+              </w:rPr>
+              <w:t>$36 000 - $66 000</w:t>
+            </w:r>
+          </w:p>
+        </w:tc>
+      </w:tr>
+    </w:tbl>
+    <w:p>
+      <w:pPr>
+        <w:spacing w:after="80"/>
+      </w:pPr>
+    </w:p>
+    <w:p>
+      <w:r>
+        <w:rPr>
+          <w:b w:val="0"/>
+          <w:i w:val="0"/>
+        </w:rPr>
+        <w:t>Цей проект виконується силами IT-відділу EMET — додаткових витрат на залучення зовнішніх підрядників не закладено.</w:t>
+      </w:r>
+    </w:p>
+    <w:p>
+      <w:pPr>
         <w:spacing w:before="80" w:after="80"/>
         <w:pBdr>
           <w:bottom w:val="single" w:sz="6" w:color="066AAB"/>
@@ -3116,6 +3581,36 @@
     </w:p>
     <w:p>
       <w:pPr>
+        <w:spacing w:before="280" w:after="120"/>
+      </w:pPr>
+      <w:r>
+        <w:rPr>
+          <w:b/>
+          <w:color w:val="081E2D"/>
+          <w:sz w:val="32"/>
+        </w:rPr>
+        <w:t>Підсумок</w:t>
+      </w:r>
+    </w:p>
+    <w:p>
+      <w:r>
+        <w:rPr>
+          <w:b w:val="0"/>
+          <w:i w:val="0"/>
+        </w:rPr>
+        <w:t>Розширення перетворює Sales Planning з інструмента місячного планування у повноцінну операційну CRM відділу продажу. Менеджер виконує всю щоденну роботу з телефона у полі; керівництво отримує живу аналітику без ручних викладок з 1С. Проект виконується силами IT-відділу EMET без залучення підрядників, з інфраструктурними витратами $612/рік.</w:t>
+      </w:r>
+    </w:p>
+    <w:p>
+      <w:pPr>
+        <w:spacing w:before="80" w:after="80"/>
+        <w:pBdr>
+          <w:bottom w:val="single" w:sz="6" w:color="066AAB"/>
+        </w:pBdr>
+      </w:pPr>
+    </w:p>
+    <w:p>
+      <w:pPr>
         <w:spacing w:before="160"/>
       </w:pPr>
       <w:r>
@@ -3124,7 +3619,7 @@
           <w:color w:val="64748B"/>
           <w:sz w:val="20"/>
         </w:rPr>
-        <w:t>Поточна версія 8.0 (2026-06-02). Документ оновлюється при будь-якому значному уточненні.</w:t>
+        <w:t>Поточна версія 8.1 (2026-06-02). Документ оновлюється при будь-якому значному уточненні.</w:t>
       </w:r>
     </w:p>
     <w:sectPr>

</xml_diff>